<commit_message>
Declara la transferencia internacional de datos (Supabase, EE. UU.) en la documentación
- SC-18 en el Control Integrado de Cambios (doc 11)
- Política de Privacidad, RAT (doc 16), riesgo R-09 (doc 15), RNF en ERS y doc 04
- DAS, Anexo A y Plan de Pruebas (doc 18) actualizados
</commit_message>
<xml_diff>
--- a/Fase 2/Evidencias Proyecto/Evidencias de documentación/11_Control_Integrado_de_Cambios.docx
+++ b/Fase 2/Evidencias Proyecto/Evidencias de documentación/11_Control_Integrado_de_Cambios.docx
@@ -4057,6 +4057,136 @@
                 <w:szCs w:val="15"/>
               </w:rPr>
               <w:t>Bajo — Todos los documentos (portada y referencias), DAS, cronograma (hitos H5 a H9)</w:t>
+            </w:r>
+          </w:p>
+        </w:tc>
+      </w:tr>
+      <w:tr>
+        <w:trPr>
+          <w:cantSplit/>
+        </w:trPr>
+        <w:tc>
+          <w:tcPr>
+            <w:tcW w:w="760" w:type="dxa"/>
+            <w:tcMar>
+              <w:top w:w="80" w:type="dxa"/>
+              <w:left w:w="100" w:type="dxa"/>
+              <w:bottom w:w="80" w:type="dxa"/>
+              <w:right w:w="100" w:type="dxa"/>
+            </w:tcMar>
+            <w:vAlign w:val="center"/>
+          </w:tcPr>
+          <w:p>
+            <w:pPr>
+              <w:spacing w:before="0" w:after="0" w:line="240" w:lineRule="auto"/>
+            </w:pPr>
+            <w:r>
+              <w:rPr>
+                <w:rFonts w:ascii="Arial" w:hAnsi="Arial" w:cs="Arial" w:eastAsia="Arial"/>
+                <w:sz w:val="15"/>
+                <w:szCs w:val="15"/>
+              </w:rPr>
+              <w:t>SC-18</w:t>
+            </w:r>
+          </w:p>
+        </w:tc>
+        <w:tc>
+          <w:tcPr>
+            <w:tcW w:w="1045" w:type="dxa"/>
+            <w:tcMar>
+              <w:top w:w="80" w:type="dxa"/>
+              <w:left w:w="100" w:type="dxa"/>
+              <w:bottom w:w="80" w:type="dxa"/>
+              <w:right w:w="100" w:type="dxa"/>
+            </w:tcMar>
+            <w:vAlign w:val="center"/>
+          </w:tcPr>
+          <w:p>
+            <w:pPr>
+              <w:spacing w:before="0" w:after="0" w:line="240" w:lineRule="auto"/>
+            </w:pPr>
+            <w:r>
+              <w:rPr>
+                <w:rFonts w:ascii="Arial" w:hAnsi="Arial" w:cs="Arial" w:eastAsia="Arial"/>
+                <w:sz w:val="15"/>
+                <w:szCs w:val="15"/>
+              </w:rPr>
+              <w:t>20-10-2026</w:t>
+            </w:r>
+          </w:p>
+        </w:tc>
+        <w:tc>
+          <w:tcPr>
+            <w:tcW w:w="4275" w:type="dxa"/>
+            <w:tcMar>
+              <w:top w:w="80" w:type="dxa"/>
+              <w:left w:w="100" w:type="dxa"/>
+              <w:bottom w:w="80" w:type="dxa"/>
+              <w:right w:w="100" w:type="dxa"/>
+            </w:tcMar>
+            <w:vAlign w:val="center"/>
+          </w:tcPr>
+          <w:p>
+            <w:pPr>
+              <w:spacing w:before="0" w:after="0" w:line="240" w:lineRule="auto"/>
+            </w:pPr>
+            <w:r>
+              <w:rPr>
+                <w:rFonts w:ascii="Arial" w:hAnsi="Arial" w:cs="Arial" w:eastAsia="Arial"/>
+                <w:sz w:val="15"/>
+                <w:szCs w:val="15"/>
+              </w:rPr>
+              <w:t>La base de datos se implementa en Supabase (PostgreSQL 17, región us-west-2, Oregón, EE. UU.) en lugar de un servidor en Chile. Se declara la transferencia internacional de datos personales en la Política de Privacidad y en el RAT, y se actualizan los documentos 04, 15, 16, 18, DAS, ERS y Anexo A.</w:t>
+            </w:r>
+          </w:p>
+        </w:tc>
+        <w:tc>
+          <w:tcPr>
+            <w:tcW w:w="1520" w:type="dxa"/>
+            <w:tcMar>
+              <w:top w:w="80" w:type="dxa"/>
+              <w:left w:w="100" w:type="dxa"/>
+              <w:bottom w:w="80" w:type="dxa"/>
+              <w:right w:w="100" w:type="dxa"/>
+            </w:tcMar>
+            <w:vAlign w:val="center"/>
+          </w:tcPr>
+          <w:p>
+            <w:pPr>
+              <w:spacing w:before="0" w:after="0" w:line="240" w:lineRule="auto"/>
+            </w:pPr>
+            <w:r>
+              <w:rPr>
+                <w:rFonts w:ascii="Arial" w:hAnsi="Arial" w:cs="Arial" w:eastAsia="Arial"/>
+                <w:sz w:val="15"/>
+                <w:szCs w:val="15"/>
+              </w:rPr>
+              <w:t>Aprobado (equipo del proyecto)</w:t>
+            </w:r>
+          </w:p>
+        </w:tc>
+        <w:tc>
+          <w:tcPr>
+            <w:tcW w:w="1900" w:type="dxa"/>
+            <w:tcMar>
+              <w:top w:w="80" w:type="dxa"/>
+              <w:left w:w="100" w:type="dxa"/>
+              <w:bottom w:w="80" w:type="dxa"/>
+              <w:right w:w="100" w:type="dxa"/>
+            </w:tcMar>
+            <w:vAlign w:val="center"/>
+          </w:tcPr>
+          <w:p>
+            <w:pPr>
+              <w:spacing w:before="0" w:after="0" w:line="240" w:lineRule="auto"/>
+            </w:pPr>
+            <w:r>
+              <w:rPr>
+                <w:rFonts w:ascii="Arial" w:hAnsi="Arial" w:cs="Arial" w:eastAsia="Arial"/>
+                <w:sz w:val="15"/>
+                <w:szCs w:val="15"/>
+              </w:rPr>
+              <w:t>Medio — RNF de ubicación de datos, Política de Privacidad, RAT, R-09, DAS</w:t>
             </w:r>
           </w:p>
         </w:tc>

</xml_diff>